<commit_message>
Rewrite the report in plain language
Short sentences and everyday words throughout, so it can be read and
defended in front of a class. No semicolons and no em dashes in the
prose. The two that remain are the IEEE Abstract and Index Terms
labels, which the template requires.

Numbers, references and layout unchanged. Still 2 pages.
</commit_message>
<xml_diff>
--- a/Music_Report.docx
+++ b/Music_Report.docx
@@ -35,9 +35,10 @@
           <w:sz w:val="20"/>
           <w:szCs w:val="20"/>
         </w:rPr>
+        <w:br/>
         <w:t xml:space="preserve">Samar Khajuria, T00714740</w:t>
         <w:br/>
-        <w:t xml:space="preserve">COMP 4980 — Category 3: Computationally Generated Music</w:t>
+        <w:t xml:space="preserve">COMP 4980, Category 3: Computationally Generated Music</w:t>
       </w:r>
     </w:p>
     <w:p>
@@ -56,7 +57,7 @@
           <w:sz w:val="18"/>
           <w:szCs w:val="18"/>
         </w:rPr>
-        <w:t xml:space="preserve">Abstract—Procedural content generation (PCG) lets a game build its own content so that no two plays are identical, and background music is a natural target. This paper presents a deliberately minimal generator, written in Java with no external libraries, that composes level music from only two pitches. The melody alternates between a low C and a high C, with a fixed probability of repeating a pitch instead of alternating, which makes every level a different pattern. A percussion track marks each beat. The single input from the game is the difficulty level, which sets the tempo: level one plays at 80 beats per minute and level five at 200, so the same thirty-two-note pattern lasts 24.0 s on the easiest level and 9.6 s on the hardest. The generator produces a playable MIDI file per level in a few milliseconds, and a game need store only the level number rather than an audio file.</w:t>
+        <w:t xml:space="preserve">Abstract—Procedural content generation (PCG) lets a game build its own content, so that no two plays are the same. Background music is a good target for this. This paper presents a very small generator, written in Java with no outside libraries, that makes the music for each level out of only two notes. The melody mostly swaps between a low C and a high C. On each beat there is a fixed chance that it repeats the note instead of swapping, and that is what makes every level different. A drum track marks each beat. The only input from the game is the difficulty level, which sets the speed. Level one plays at 80 beats per minute and level five plays at 200, so the same thirty-two-note pattern lasts 24.0 s on the easiest level and 9.6 s on the hardest. The generator writes a playable MIDI file for each level in a few milliseconds, so a game only needs to store the level number instead of an audio file.</w:t>
       </w:r>
     </w:p>
     <w:p>
@@ -97,7 +98,7 @@
           <w:sz w:val="20"/>
           <w:szCs w:val="20"/>
         </w:rPr>
-        <w:t xml:space="preserve">Procedural content generation builds game content with algorithms rather than by hand, so that each play can differ [1]. Music is a good candidate, because a conventional soundtrack plays identically every time a level is replayed, while generated music can change on every run and can respond to what the player is doing [2]. Using computers to compose is not new: Hiller and Isaacson produced the Illiac Suite from rules and random choices in the 1950s [3], and later systems use Markov models, grammars and other algorithms [4].</w:t>
+        <w:t xml:space="preserve">Procedural content generation builds game content with algorithms instead of by hand, so that each play can be different [1]. Music is a good fit for this. A normal soundtrack plays the same way every time a level is replayed, but generated music can change on every run and can react to what the player is doing [2]. Using computers to compose is not new. Hiller and Isaacson made the Illiac Suite from rules and random choices in the 1950s [3], and later systems use Markov models, grammars and other algorithms [4].</w:t>
       </w:r>
     </w:p>
     <w:p>
@@ -107,7 +108,7 @@
           <w:sz w:val="20"/>
           <w:szCs w:val="20"/>
         </w:rPr>
-        <w:t xml:space="preserve">Most generative music systems aim for musical richness. This project asks the opposite question: what is the smallest generator that still produces usable, varying game music that reacts to the game? The answer presented here uses two pitches, one probability and one input from the game. Keeping the system this small makes every design decision visible and makes the link between game state and musical output easy to demonstrate.</w:t>
+        <w:t xml:space="preserve">Most systems that generate music try to make it rich and varied. This project asks the opposite question. What is the smallest generator that still makes useful game music and still reacts to the game? The answer here uses two notes, one chance value and one input from the game. Keeping it this small makes every design choice easy to see, and it makes the link between the game and the music easy to show.</w:t>
       </w:r>
     </w:p>
     <w:p>
@@ -141,7 +142,7 @@
           <w:sz w:val="20"/>
           <w:szCs w:val="20"/>
         </w:rPr>
-        <w:t xml:space="preserve">The melody uses only two pitches: MIDI note 60, middle C, and MIDI note 72, the C one octave above it. Each piece is thirty-two notes long and plays one note per beat. The generator keeps a current pitch, writes it down, and then decides the next one. The default behaviour is to swap to the other pitch, which produces a regular alternation of low, high, low, high. Because the two pitches are an octave apart they are the same note name, so the alternation is always consonant and no key or scale has to be defined.</w:t>
+        <w:t xml:space="preserve">The melody uses only two notes. One is MIDI note 60, which is middle C. The other is MIDI note 72, which is the C one octave higher. Each piece is thirty-two notes long and plays one note per beat. The generator keeps track of the current note, writes it down, and then picks the next one. Normally it swaps to the other note, which gives a steady pattern of low, high, low, high. The two notes are an octave apart, so they have the same note name and always sound right together. This means no key or scale has to be defined.</w:t>
       </w:r>
     </w:p>
     <w:p>
@@ -163,7 +164,7 @@
           <w:sz w:val="20"/>
           <w:szCs w:val="20"/>
         </w:rPr>
-        <w:t xml:space="preserve">A generator that only alternates would produce the same piece every time. On each beat the generator therefore draws a whole number from 0 to 99 and, when it falls below 25, keeps the current pitch instead of swapping. A repeat shifts the phase of the alternation, so a run such as low, high, low, low, high is produced and the regular pulse is broken in a different place on every level. The random number generator is seeded with the level number, so a level always receives the same music while different levels receive different music.</w:t>
+        <w:t xml:space="preserve">A generator that only swaps would make the same piece every time. To stop that, the generator rolls a whole number from 0 to 99 on each beat. If that number is under 25, it keeps the current note instead of swapping. A repeat shifts the pattern onto the opposite foot, so a run such as low, high, low, low, high appears and the steady pulse breaks in a different place on every level. The random number generator starts from the level number, so each level always gets the same music back, while different levels get different music.</w:t>
       </w:r>
     </w:p>
     <w:p>
@@ -173,7 +174,7 @@
           <w:sz w:val="20"/>
           <w:szCs w:val="20"/>
         </w:rPr>
-        <w:t xml:space="preserve">This is a two-state Markov process: the next pitch depends only on the current one, with a 0.75 chance of changing state and a 0.25 chance of remaining [5]. The repeat probability is the single parameter controlling how regular the output sounds. A value of zero yields a perfectly periodic pattern, while larger values increasingly obscure the pulse.</w:t>
+        <w:t xml:space="preserve">This is a two-state Markov process. The next note depends only on the current one, with a 0.75 chance of changing and a 0.25 chance of staying [5]. The repeat chance is the one setting that controls how regular the music sounds. A value of zero gives a perfectly even pattern. Larger values break up the pulse more often.</w:t>
       </w:r>
     </w:p>
     <w:p>
@@ -183,7 +184,7 @@
           <w:sz w:val="20"/>
           <w:szCs w:val="20"/>
         </w:rPr>
-        <w:t xml:space="preserve">A percussion track plays a bass drum on every beat on MIDI channel 10. The drum is constant across levels, so it establishes the pulse against which the melodic repeats are heard as variation rather than as noise.</w:t>
+        <w:t xml:space="preserve">A drum track plays a bass drum on every beat on MIDI channel 10. The drum is the same on every level, so it sets a steady pulse. The melody repeats are then heard as variation against that pulse rather than as noise.</w:t>
       </w:r>
     </w:p>
     <w:p>
@@ -205,7 +206,7 @@
           <w:sz w:val="20"/>
           <w:szCs w:val="20"/>
         </w:rPr>
-        <w:t xml:space="preserve">The generator takes one input from the game: the level number. Level one plays at a base tempo of 80 beats per minute and each level above it adds a fixed increment of 30, so level five plays at 200. Because every piece contains the same thirty-two notes, raising the tempo shortens the piece and raises the note rate in proportion. No other musical parameter changes, so the levels remain recognisably the same piece played with increasing urgency. In the taxonomy of Shaker et al. [1] the generator is stochastic, constructive and automatic, and because its output follows the state of the game rather than a seed alone, it is adaptive rather than generic.</w:t>
+        <w:t xml:space="preserve">The generator takes one input from the game, which is the level number. Level one plays at a base speed of 80 beats per minute. Every level above that adds a fixed step of 30, so level five plays at 200. Every piece has the same thirty-two notes, so raising the speed makes the piece shorter and raises the note rate by the same amount. Nothing else about the music changes, so the levels still sound like the same piece played with more urgency. In the taxonomy of Shaker et al. [1] this generator is stochastic, constructive and automatic. It is also adaptive rather than generic, because its output follows the state of the game and not just a random seed.</w:t>
       </w:r>
     </w:p>
     <w:p>
@@ -227,7 +228,7 @@
           <w:sz w:val="20"/>
           <w:szCs w:val="20"/>
         </w:rPr>
-        <w:t xml:space="preserve">The generator is a single Java class of roughly 220 lines. MIDI files are written with javax.sound.midi and the figure is drawn with java.awt, both part of the standard library, so the program compiles and runs with no external dependencies. Arithmetic is kept to whole numbers wherever possible, including the tempo calculation and the repeat decision, so the code reads without type conversions. Each level is written as a two-track MIDI file, one for the melody and one for percussion, which opens in any digital audio workstation. A complete run writes five MIDI files and one figure in under a second.</w:t>
+        <w:t xml:space="preserve">The generator is a single Java class of about 220 lines. MIDI files are written with javax.sound.midi and the figure is drawn with java.awt. Both of these come with Java, so the program builds and runs with no outside libraries. The arithmetic uses whole numbers wherever possible, including the speed calculation and the repeat decision, so the code reads without type conversions. Each level is written as a MIDI file with two tracks, one for the melody and one for the drum, and it opens in any music program. A full run writes five MIDI files and one figure in under a second.</w:t>
       </w:r>
     </w:p>
     <w:p>
@@ -1311,7 +1312,7 @@
           <w:sz w:val="20"/>
           <w:szCs w:val="20"/>
         </w:rPr>
-        <w:t xml:space="preserve">Table I shows the effect of the difficulty input. The tempo rises linearly from 80 to 200 beats per minute, which shortens the same thirty-two-note pattern from 24.0 s to 9.6 s and raises the note rate from 1.33 to 3.33 notes per second, a factor of 2.5. The number of repeated pitches ranges from 6 to 14 with a mean of 8.4, against the 7.75 expected from a repeat probability of 0.25 over thirty-one transitions. With only thirty-one decisions per level that spread is ordinary sampling variation rather than an effect of difficulty: the repeat probability is a constant and is never read from the level number, so the levels differ in speed alone. Fig. 1 shows the resulting patterns.</w:t>
+        <w:t xml:space="preserve">Table I shows what the difficulty input does. The speed rises evenly from 80 to 200 beats per minute. That shortens the same thirty-two-note pattern from 24.0 s to 9.6 s and raises the note rate from 1.33 to 3.33 notes per second, which is a factor of 2.5. The number of repeated notes ranges from 6 to 14, with a mean of 8.4. A repeat chance of 0.25 over thirty-one decisions gives an expected value of 7.75. With only thirty-one decisions per level, that spread is normal randomness and not an effect of difficulty. The repeat chance is a constant and is never read from the level number, so the levels differ in speed alone. Fig. 1 shows the patterns.</w:t>
       </w:r>
     </w:p>
     <w:p>
@@ -1373,7 +1374,7 @@
           <w:sz w:val="16"/>
           <w:szCs w:val="16"/>
         </w:rPr>
-        <w:t xml:space="preserve">Fig. 1.  The generated pattern for each level. Each block is one beat; blocks on the upper row are the high C and blocks on the lower row are the low C. The alternation is visible as a zig-zag, and the random repeats appear as two adjacent blocks on the same row.</w:t>
+        <w:t xml:space="preserve">Fig. 1.  The pattern for each level. Each block is one beat. Blocks on the upper row are the high C and blocks on the lower row are the low C. The swapping shows up as a zig-zag, and the random repeats show up as two blocks next to each other on the same row.</w:t>
       </w:r>
     </w:p>
     <w:p>
@@ -1395,7 +1396,7 @@
           <w:sz w:val="20"/>
           <w:szCs w:val="20"/>
         </w:rPr>
-        <w:t xml:space="preserve">A generator built from two pitches, one probability and one input produces music that is different on every level and that audibly tracks difficulty. The cost is low: one source file, no dependencies, a few milliseconds per piece, and a game that stores a level number instead of an audio file. The limitations follow directly from the design. With only two pitches there is no melody in any meaningful sense, and the output is better described as an adaptive rhythmic pulse than as a tune. Nothing was evaluated with listeners, so the claim that faster music feels harder rests on convention rather than evidence. Useful next steps would be to add a small set of pitches so that the generator can imply a key, to vary the percussion as well as the tempo, and to drive the difficulty input from live game state rather than from the level number, in the manner of the adaptive pacing used in Left 4 Dead [2].</w:t>
+        <w:t xml:space="preserve">A generator built from two notes, one chance value and one input makes music that is different on every level and that clearly tracks difficulty. The cost is low. It is one source file with no outside libraries, it takes a few milliseconds per piece, and a game stores a level number instead of an audio file. The limits come straight from the design. With only two notes there is no real melody, and the result is closer to an adaptive pulse than to a tune. Nothing was tested with listeners, so the idea that faster music feels harder rests on convention and not on evidence. Good next steps would be to add a small set of notes so the generator can suggest a key, to change the drum as well as the speed, and to drive the difficulty input from live game state instead of the level number, in the way the adaptive pacing works in Left 4 Dead [2].</w:t>
       </w:r>
     </w:p>
     <w:p>

</xml_diff>

<commit_message>
Replace the three book references with journal papers
The taxonomy book, the Illiac Suite book and the algorithmic
composition book are swapped for the peer reviewed papers behind them,
each with a DOI or an open access copy.

The taxonomy paper does not use the words adaptive, generic or
automatic, so the sentence citing it now claims only what that paper
supports and states the adaptive behaviour as an observation about this
generator rather than as a label from the source.
</commit_message>
<xml_diff>
--- a/Music_Report.docx
+++ b/Music_Report.docx
@@ -1,6 +1,6 @@
 
 <file path=word/document.xml><?xml version="1.0" encoding="utf-8"?>
-<w:document xmlns:pic="http://schemas.openxmlformats.org/drawingml/2006/picture" xmlns:a="http://schemas.openxmlformats.org/drawingml/2006/main" xmlns:wpc="http://schemas.microsoft.com/office/word/2010/wordprocessingCanvas" xmlns:cx="http://schemas.microsoft.com/office/drawing/2014/chartex" xmlns:cx1="http://schemas.microsoft.com/office/drawing/2015/9/8/chartex" xmlns:cx2="http://schemas.microsoft.com/office/drawing/2015/10/21/chartex" xmlns:cx3="http://schemas.microsoft.com/office/drawing/2016/5/9/chartex" xmlns:cx4="http://schemas.microsoft.com/office/drawing/2016/5/10/chartex" xmlns:cx5="http://schemas.microsoft.com/office/drawing/2016/5/11/chartex" xmlns:cx6="http://schemas.microsoft.com/office/drawing/2016/5/12/chartex" xmlns:cx7="http://schemas.microsoft.com/office/drawing/2016/5/13/chartex" xmlns:cx8="http://schemas.microsoft.com/office/drawing/2016/5/14/chartex" xmlns:mc="http://schemas.openxmlformats.org/markup-compatibility/2006" xmlns:m="http://schemas.openxmlformats.org/officeDocument/2006/math" xmlns:aink="http://schemas.microsoft.com/office/drawing/2016/ink" xmlns:am3d="http://schemas.microsoft.com/office/drawing/2017/model3d" xmlns:oel="http://schemas.microsoft.com/office/2019/extlst" xmlns:r="http://schemas.openxmlformats.org/officeDocument/2006/relationships" xmlns:wp14="http://schemas.microsoft.com/office/word/2010/wordprocessingDrawing" xmlns:wp="http://schemas.openxmlformats.org/drawingml/2006/wordprocessingDrawing" xmlns:wpg="http://schemas.microsoft.com/office/word/2010/wordprocessingGroup" xmlns:wpi="http://schemas.microsoft.com/office/word/2010/wordprocessingInk" xmlns:wps="http://schemas.microsoft.com/office/word/2010/wordprocessingShape" xmlns:o="urn:schemas-microsoft-com:office:office" xmlns:v="urn:schemas-microsoft-com:vml" xmlns:w10="urn:schemas-microsoft-com:office:word" xmlns:w="http://schemas.openxmlformats.org/wordprocessingml/2006/main" xmlns:w14="http://schemas.microsoft.com/office/word/2010/wordml" xmlns:w15="http://schemas.microsoft.com/office/word/2012/wordml" xmlns:w16cex="http://schemas.microsoft.com/office/word/2018/wordml/cex" xmlns:w16cid="http://schemas.microsoft.com/office/word/2016/wordml/cid" xmlns:w16="http://schemas.microsoft.com/office/word/2018/wordml" xmlns:w16sdtdh="http://schemas.microsoft.com/office/word/2020/wordml/sdtdatahash" xmlns:w16sdtfl="http://schemas.microsoft.com/office/word/2024/wordml/sdtformatlock" xmlns:w16se="http://schemas.microsoft.com/office/word/2015/wordml/symex" xmlns:w16du="http://schemas.microsoft.com/office/word/2023/wordml/word16du" xmlns:wne="http://schemas.microsoft.com/office/word/2006/wordml" mc:Ignorable="w14 w15 w16se w16cid w16 w16cex w16sdtdh w16sdtfl w16du wp14">
+<w:document xmlns:a="http://schemas.openxmlformats.org/drawingml/2006/main" xmlns:mc="http://schemas.openxmlformats.org/markup-compatibility/2006" xmlns:pic="http://schemas.openxmlformats.org/drawingml/2006/picture" xmlns:r="http://schemas.openxmlformats.org/officeDocument/2006/relationships" xmlns:w="http://schemas.openxmlformats.org/wordprocessingml/2006/main" xmlns:w14="http://schemas.microsoft.com/office/word/2010/wordml" xmlns:wp="http://schemas.openxmlformats.org/drawingml/2006/wordprocessingDrawing" xmlns:wp14="http://schemas.microsoft.com/office/word/2010/wordprocessingDrawing" mc:Ignorable="w14 w15 w16se w16cid w16 w16cex w16sdtdh w16sdtfl w16du wp14">
   <w:body>
     <w:p>
       <w:pPr>
@@ -188,7 +188,7 @@
     </w:p>
     <w:p>
       <w:r>
-        <w:t>The generator takes one input from the game, which is the level number. Level one plays at a base speed of 80 beats per minute. Every level above that adds a fixed step of 30, so level five plays at 200. Every piece has thirty-two notes, so raising the speed makes the piece shorter and raises the note rate by the same amount. The note patterns vary with the level seed, but the pitches, repeat chance and drum stay fixed. In the taxonomy of Shaker et al. [1] this generator is stochastic, constructive and automatic. It is also adaptive rather than generic, because its output follows the state of the game and not just a random seed.</w:t>
+        <w:t xml:space="preserve">The generator takes one input from the game, which is the level number. Level one plays at a base speed of 80 beats per minute. Every level above that adds a fixed step of 30, so level five plays at 200. Every piece has thirty-two notes, so raising the speed makes the piece shorter and raises the note rate by the same amount. The note patterns vary with the level seed, but the pitches, repeat chance and drum stay fixed. In the taxonomy of Togelius et al. [1] this generator is stochastic, because it uses randomness, and constructive, because it builds each piece in one pass instead of testing and rejecting. Its output follows the state of the game and not just a random seed, so the music adapts as the player progresses.</w:t>
       </w:r>
     </w:p>
     <w:p>
@@ -1380,7 +1380,7 @@
           <w:sz w:val="16"/>
           <w:szCs w:val="16"/>
         </w:rPr>
-        <w:t>[1]</w:t>
+        <w:t xml:space="preserve">[1]</w:t>
       </w:r>
       <w:r>
         <w:rPr>
@@ -1388,7 +1388,7 @@
           <w:szCs w:val="16"/>
         </w:rPr>
         <w:tab/>
-        <w:t xml:space="preserve">N. Shaker, J. Togelius, and M. J. Nelson, </w:t>
+        <w:t xml:space="preserve">J. Togelius, G. N. Yannakakis, K. O. Stanley, and C. Browne, “Search-based procedural content generation: A taxonomy and survey,” </w:t>
       </w:r>
       <w:r>
         <w:rPr>
@@ -1397,14 +1397,14 @@
           <w:sz w:val="16"/>
           <w:szCs w:val="16"/>
         </w:rPr>
-        <w:t>Procedural Content Generation in Games</w:t>
+        <w:t xml:space="preserve">IEEE Trans. Comput. Intell. AI Games</w:t>
       </w:r>
       <w:r>
         <w:rPr>
           <w:sz w:val="16"/>
           <w:szCs w:val="16"/>
         </w:rPr>
-        <w:t>. Cham, Switzerland: Springer, 2016.</w:t>
+        <w:t xml:space="preserve">, vol. 3, no. 3, pp. 172–186, Sep. 2011, doi: 10.1109/TCIAIG.2011.2148116.</w:t>
       </w:r>
     </w:p>
     <w:p>
@@ -1476,7 +1476,7 @@
           <w:sz w:val="16"/>
           <w:szCs w:val="16"/>
         </w:rPr>
-        <w:t>[3]</w:t>
+        <w:t xml:space="preserve">[3]</w:t>
       </w:r>
       <w:r>
         <w:rPr>
@@ -1484,7 +1484,7 @@
           <w:szCs w:val="16"/>
         </w:rPr>
         <w:tab/>
-        <w:t xml:space="preserve">L. A. Hiller and L. M. Isaacson, </w:t>
+        <w:t xml:space="preserve">L. A. Hiller and L. M. Isaacson, “Musical composition with a high-speed digital computer,” </w:t>
       </w:r>
       <w:r>
         <w:rPr>
@@ -1493,14 +1493,14 @@
           <w:sz w:val="16"/>
           <w:szCs w:val="16"/>
         </w:rPr>
-        <w:t>Experimental Music: Composition with an Electronic Computer</w:t>
+        <w:t xml:space="preserve">J. Audio Eng. Soc.</w:t>
       </w:r>
       <w:r>
         <w:rPr>
           <w:sz w:val="16"/>
           <w:szCs w:val="16"/>
         </w:rPr>
-        <w:t>. New York, NY, USA: McGraw-Hill, 1959.</w:t>
+        <w:t xml:space="preserve">, vol. 6, no. 3, pp. 154–160, 1958.</w:t>
       </w:r>
     </w:p>
     <w:p>
@@ -1516,7 +1516,7 @@
           <w:sz w:val="16"/>
           <w:szCs w:val="16"/>
         </w:rPr>
-        <w:t>[4]</w:t>
+        <w:t xml:space="preserve">[4]</w:t>
       </w:r>
       <w:r>
         <w:rPr>
@@ -1524,7 +1524,7 @@
           <w:szCs w:val="16"/>
         </w:rPr>
         <w:tab/>
-        <w:t xml:space="preserve">G. Nierhaus, </w:t>
+        <w:t xml:space="preserve">J. D. Fernández and F. J. Vico, “AI methods in algorithmic composition: A comprehensive survey,” </w:t>
       </w:r>
       <w:r>
         <w:rPr>
@@ -1533,14 +1533,14 @@
           <w:sz w:val="16"/>
           <w:szCs w:val="16"/>
         </w:rPr>
-        <w:t>Algorithmic Composition: Paradigms of Automated Music Generation</w:t>
+        <w:t xml:space="preserve">J. Artif. Intell. Res.</w:t>
       </w:r>
       <w:r>
         <w:rPr>
           <w:sz w:val="16"/>
           <w:szCs w:val="16"/>
         </w:rPr>
-        <w:t>. Vienna, Austria: Springer, 2009.</w:t>
+        <w:t xml:space="preserve">, vol. 48, pp. 513–582, 2013, doi: 10.1613/jair.3908.</w:t>
       </w:r>
     </w:p>
     <w:p>

</xml_diff>